<commit_message>
Setup complete GitHub Actions CI/CD pipeline
- Add .dockerignore for backend and frontend
- Improve Dockerfiles with health checks
- Enhance docker-compose.yml with health checks and env variables
- Create GitHub Actions workflows:
  * build-push.yml: Auto build and push Docker images
  * tests.yml: Run pytest for backend and Jest for frontend
  * code-quality.yml: Linting and security scanning
  * deploy.yml: Deployment workflow
- Add test setup for backend (pytest) and frontend (Jest)
- Create comprehensive setup documentation:
  * GITHUB_SETUP.md: Setup guide for secrets
  * CI_CD_SUMMARY.md: Overview of CI/CD pipeline
- Update requirements.txt with test dependencies
- Add .env.example at root level
</commit_message>
<xml_diff>
--- a/Ứng Dụng Học.docx
+++ b/Ứng Dụng Học.docx
@@ -507,6 +507,28 @@
       </w:r>
       <w:r>
         <w:t xml:space="preserve"> Nếu mô hình AI phát hiện điểm bất thường (ví dụ: mất tích khỏi khung hình), nó lập tức đẩy một sự kiện báo động ngược lại luồng WebSocket để hiển thị màu đỏ trên Dashboard của giảng viên.</w:t>
+      </w:r>
+    </w:p>
+    <w:p>
+      <w:pPr>
+        <w:numPr>
+          <w:ilvl w:val="0"/>
+          <w:numId w:val="7"/>
+        </w:numPr>
+      </w:pPr>
+      <w:r>
+        <w:rPr>
+          <w:b/>
+          <w:bCs/>
+          <w:lang w:val="en-US"/>
+        </w:rPr>
+        <w:t xml:space="preserve">Quá 10s không tương tác gì trên màn hình: </w:t>
+      </w:r>
+      <w:r>
+        <w:rPr>
+          <w:lang w:val="en-US"/>
+        </w:rPr>
+        <w:t>thì sẽ có thông báo nhắc nhở</w:t>
       </w:r>
     </w:p>
     <w:p>
@@ -2682,6 +2704,7 @@
   <w:style w:type="character" w:default="1" w:styleId="DefaultParagraphFont">
     <w:name w:val="Default Paragraph Font"/>
     <w:uiPriority w:val="1"/>
+    <w:semiHidden/>
     <w:unhideWhenUsed/>
   </w:style>
   <w:style w:type="table" w:default="1" w:styleId="TableNormal">

</xml_diff>